<commit_message>
docs: complete Phase 2 specifications and update logo
</commit_message>
<xml_diff>
--- a/Documents Phases/Updated FYP Phase 2 Document Template.docx
+++ b/Documents Phases/Updated FYP Phase 2 Document Template.docx
@@ -27,19 +27,7 @@
         <w:t>S</w:t>
       </w:r>
       <w:r>
-        <w:t>(</w:t>
-      </w:r>
-      <w:r>
-        <w:t>CS/</w:t>
-      </w:r>
-      <w:r>
         <w:t>SE</w:t>
-      </w:r>
-      <w:r>
-        <w:t>/DS/AI</w:t>
-      </w:r>
-      <w:r>
-        <w:t>)</w:t>
       </w:r>
       <w:r>
         <w:t xml:space="preserve"> FINAL PROJECT</w:t>
@@ -88,7 +76,15 @@
           <w:sz w:val="56"/>
           <w:szCs w:val="24"/>
         </w:rPr>
-        <w:t>&lt;Project Title&gt;</w:t>
+        <w:t>P</w:t>
+      </w:r>
+      <w:r>
+        <w:rPr>
+          <w:rFonts w:ascii="Times New Roman" w:hAnsi="Times New Roman"/>
+          <w:sz w:val="56"/>
+          <w:szCs w:val="24"/>
+        </w:rPr>
+        <w:t>etLink</w:t>
       </w:r>
     </w:p>
     <w:p>
@@ -260,7 +256,7 @@
           <w:sz w:val="28"/>
           <w:szCs w:val="24"/>
         </w:rPr>
-        <w:t>&lt;Supervisor Name&gt;</w:t>
+        <w:t>Zupash Awais</w:t>
       </w:r>
     </w:p>
     <w:p>
@@ -340,16 +336,14 @@
         </w:rPr>
         <w:t xml:space="preserve"> Group ID: </w:t>
       </w:r>
-      <w:proofErr w:type="spellStart"/>
       <w:r>
         <w:rPr>
           <w:rFonts w:ascii="Times New Roman" w:hAnsi="Times New Roman"/>
           <w:sz w:val="28"/>
           <w:szCs w:val="24"/>
         </w:rPr>
-        <w:t>xxxxxxx</w:t>
-      </w:r>
-      <w:proofErr w:type="spellEnd"/>
+        <w:t>S26SE025</w:t>
+      </w:r>
     </w:p>
     <w:p>
       <w:pPr>
@@ -624,7 +618,16 @@
           <w:sz w:val="36"/>
           <w:szCs w:val="36"/>
         </w:rPr>
-        <w:t>Version &lt;Version #&gt;</w:t>
+        <w:t xml:space="preserve">Version </w:t>
+      </w:r>
+      <w:r>
+        <w:rPr>
+          <w:rFonts w:asciiTheme="majorBidi" w:hAnsiTheme="majorBidi" w:cstheme="majorBidi"/>
+          <w:b w:val="0"/>
+          <w:sz w:val="36"/>
+          <w:szCs w:val="36"/>
+        </w:rPr>
+        <w:t>1.0</w:t>
       </w:r>
     </w:p>
     <w:p>
@@ -678,19 +681,72 @@
         <w:jc w:val="left"/>
         <w:rPr>
           <w:rFonts w:asciiTheme="majorBidi" w:hAnsiTheme="majorBidi" w:cstheme="majorBidi"/>
+          <w:sz w:val="36"/>
+          <w:szCs w:val="36"/>
+        </w:rPr>
+      </w:pPr>
+      <w:r>
+        <w:rPr>
+          <w:rFonts w:asciiTheme="majorBidi" w:hAnsiTheme="majorBidi" w:cstheme="majorBidi"/>
           <w:b w:val="0"/>
           <w:sz w:val="36"/>
           <w:szCs w:val="36"/>
         </w:rPr>
-      </w:pPr>
-      <w:r>
+        <w:t>Zupash Awais</w:t>
+      </w:r>
+    </w:p>
+    <w:p>
+      <w:pPr>
+        <w:pStyle w:val="Title"/>
+        <w:spacing w:before="0" w:after="100" w:afterAutospacing="1"/>
+        <w:jc w:val="left"/>
+        <w:rPr>
+          <w:rFonts w:asciiTheme="majorBidi" w:hAnsiTheme="majorBidi" w:cstheme="majorBidi"/>
+          <w:sz w:val="36"/>
+          <w:szCs w:val="36"/>
+        </w:rPr>
+      </w:pPr>
+    </w:p>
+    <w:p>
+      <w:pPr>
+        <w:pStyle w:val="Title"/>
+        <w:spacing w:before="0" w:after="100" w:afterAutospacing="1"/>
+        <w:jc w:val="left"/>
+        <w:rPr>
+          <w:rFonts w:asciiTheme="majorBidi" w:hAnsiTheme="majorBidi" w:cstheme="majorBidi"/>
+          <w:sz w:val="36"/>
+          <w:szCs w:val="36"/>
+        </w:rPr>
+      </w:pPr>
+      <w:r>
+        <w:rPr>
+          <w:rFonts w:asciiTheme="majorBidi" w:hAnsiTheme="majorBidi" w:cstheme="majorBidi"/>
+          <w:sz w:val="36"/>
+          <w:szCs w:val="36"/>
+        </w:rPr>
+        <w:t>Scrum Master</w:t>
+      </w:r>
+    </w:p>
+    <w:p>
+      <w:pPr>
+        <w:pStyle w:val="Title"/>
+        <w:spacing w:before="0" w:after="100" w:afterAutospacing="1"/>
+        <w:jc w:val="left"/>
         <w:rPr>
           <w:rFonts w:asciiTheme="majorBidi" w:hAnsiTheme="majorBidi" w:cstheme="majorBidi"/>
           <w:b w:val="0"/>
           <w:sz w:val="36"/>
           <w:szCs w:val="36"/>
         </w:rPr>
-        <w:t>&lt;Supervisor Name&gt;</w:t>
+      </w:pPr>
+      <w:r>
+        <w:rPr>
+          <w:rFonts w:asciiTheme="majorBidi" w:hAnsiTheme="majorBidi" w:cstheme="majorBidi"/>
+          <w:b w:val="0"/>
+          <w:sz w:val="36"/>
+          <w:szCs w:val="36"/>
+        </w:rPr>
+        <w:t>Nabeel Ijaz</w:t>
       </w:r>
     </w:p>
     <w:p>
@@ -728,81 +784,17 @@
           <w:szCs w:val="36"/>
         </w:rPr>
       </w:pPr>
+      <w:bookmarkStart w:id="7" w:name="_Hlk230906326"/>
       <w:r>
         <w:rPr>
           <w:rFonts w:asciiTheme="majorBidi" w:hAnsiTheme="majorBidi" w:cstheme="majorBidi"/>
           <w:sz w:val="36"/>
           <w:szCs w:val="36"/>
         </w:rPr>
-        <w:t>Scrum Master</w:t>
-      </w:r>
-    </w:p>
-    <w:p>
-      <w:pPr>
-        <w:pStyle w:val="Title"/>
-        <w:spacing w:before="0" w:after="100" w:afterAutospacing="1"/>
-        <w:jc w:val="left"/>
-        <w:rPr>
-          <w:rFonts w:asciiTheme="majorBidi" w:hAnsiTheme="majorBidi" w:cstheme="majorBidi"/>
-          <w:b w:val="0"/>
-          <w:sz w:val="36"/>
-          <w:szCs w:val="36"/>
-        </w:rPr>
-      </w:pPr>
-      <w:r>
-        <w:rPr>
-          <w:rFonts w:asciiTheme="majorBidi" w:hAnsiTheme="majorBidi" w:cstheme="majorBidi"/>
-          <w:b w:val="0"/>
-          <w:sz w:val="36"/>
-          <w:szCs w:val="36"/>
-        </w:rPr>
-        <w:t>&lt;Student Name&gt;</w:t>
-      </w:r>
-    </w:p>
-    <w:p>
-      <w:pPr>
-        <w:pStyle w:val="Title"/>
-        <w:spacing w:before="0" w:after="100" w:afterAutospacing="1"/>
-        <w:jc w:val="left"/>
-        <w:rPr>
-          <w:rFonts w:asciiTheme="majorBidi" w:hAnsiTheme="majorBidi" w:cstheme="majorBidi"/>
-          <w:sz w:val="36"/>
-          <w:szCs w:val="36"/>
-        </w:rPr>
-      </w:pPr>
-    </w:p>
-    <w:p>
-      <w:pPr>
-        <w:pStyle w:val="Title"/>
-        <w:spacing w:before="0" w:after="100" w:afterAutospacing="1"/>
-        <w:jc w:val="left"/>
-        <w:rPr>
-          <w:rFonts w:asciiTheme="majorBidi" w:hAnsiTheme="majorBidi" w:cstheme="majorBidi"/>
-          <w:sz w:val="36"/>
-          <w:szCs w:val="36"/>
-        </w:rPr>
-      </w:pPr>
-    </w:p>
-    <w:p>
-      <w:pPr>
-        <w:pStyle w:val="Title"/>
-        <w:spacing w:before="0" w:after="100" w:afterAutospacing="1"/>
-        <w:jc w:val="left"/>
-        <w:rPr>
-          <w:rFonts w:asciiTheme="majorBidi" w:hAnsiTheme="majorBidi" w:cstheme="majorBidi"/>
-          <w:sz w:val="36"/>
-          <w:szCs w:val="36"/>
-        </w:rPr>
-      </w:pPr>
-      <w:r>
-        <w:rPr>
-          <w:rFonts w:asciiTheme="majorBidi" w:hAnsiTheme="majorBidi" w:cstheme="majorBidi"/>
-          <w:sz w:val="36"/>
-          <w:szCs w:val="36"/>
-        </w:rPr>
-        <w:t>Group &lt;Group ID&gt;</w:t>
-      </w:r>
-    </w:p>
+        <w:t>S26SE025</w:t>
+      </w:r>
+    </w:p>
+    <w:bookmarkEnd w:id="7"/>
     <w:p>
       <w:pPr>
         <w:pStyle w:val="Title"/>
@@ -945,11 +937,17 @@
               <w:spacing w:before="0" w:after="0"/>
               <w:jc w:val="left"/>
               <w:rPr>
-                <w:rFonts w:asciiTheme="majorBidi" w:hAnsiTheme="majorBidi" w:cstheme="majorBidi"/>
+                <w:rFonts w:ascii="Times New Roman" w:hAnsi="Times New Roman"/>
                 <w:sz w:val="36"/>
                 <w:szCs w:val="36"/>
               </w:rPr>
             </w:pPr>
+            <w:r>
+              <w:rPr>
+                <w:rFonts w:ascii="Times New Roman" w:hAnsi="Times New Roman"/>
+              </w:rPr>
+              <w:t>Nabeel Ijaz</w:t>
+            </w:r>
           </w:p>
         </w:tc>
         <w:tc>
@@ -962,11 +960,17 @@
               <w:spacing w:before="0" w:after="0"/>
               <w:jc w:val="left"/>
               <w:rPr>
-                <w:rFonts w:asciiTheme="majorBidi" w:hAnsiTheme="majorBidi" w:cstheme="majorBidi"/>
+                <w:rFonts w:ascii="Times New Roman" w:hAnsi="Times New Roman"/>
                 <w:sz w:val="36"/>
                 <w:szCs w:val="36"/>
               </w:rPr>
             </w:pPr>
+            <w:r>
+              <w:rPr>
+                <w:rFonts w:ascii="Times New Roman" w:hAnsi="Times New Roman"/>
+              </w:rPr>
+              <w:t>Backend Development</w:t>
+            </w:r>
           </w:p>
         </w:tc>
       </w:tr>
@@ -984,11 +988,17 @@
               <w:spacing w:before="0" w:after="0"/>
               <w:jc w:val="left"/>
               <w:rPr>
-                <w:rFonts w:asciiTheme="majorBidi" w:hAnsiTheme="majorBidi" w:cstheme="majorBidi"/>
+                <w:rFonts w:ascii="Times New Roman" w:hAnsi="Times New Roman"/>
                 <w:sz w:val="36"/>
                 <w:szCs w:val="36"/>
               </w:rPr>
             </w:pPr>
+            <w:r>
+              <w:rPr>
+                <w:rFonts w:ascii="Times New Roman" w:hAnsi="Times New Roman"/>
+              </w:rPr>
+              <w:t>Umar Akram</w:t>
+            </w:r>
           </w:p>
         </w:tc>
         <w:tc>
@@ -1001,11 +1011,17 @@
               <w:spacing w:before="0" w:after="0"/>
               <w:jc w:val="left"/>
               <w:rPr>
-                <w:rFonts w:asciiTheme="majorBidi" w:hAnsiTheme="majorBidi" w:cstheme="majorBidi"/>
+                <w:rFonts w:ascii="Times New Roman" w:hAnsi="Times New Roman"/>
                 <w:sz w:val="36"/>
                 <w:szCs w:val="36"/>
               </w:rPr>
             </w:pPr>
+            <w:r>
+              <w:rPr>
+                <w:rFonts w:ascii="Times New Roman" w:hAnsi="Times New Roman"/>
+              </w:rPr>
+              <w:t>Web Development</w:t>
+            </w:r>
           </w:p>
         </w:tc>
       </w:tr>
@@ -1023,11 +1039,17 @@
               <w:spacing w:before="0" w:after="0"/>
               <w:jc w:val="left"/>
               <w:rPr>
-                <w:rFonts w:asciiTheme="majorBidi" w:hAnsiTheme="majorBidi" w:cstheme="majorBidi"/>
+                <w:rFonts w:ascii="Times New Roman" w:hAnsi="Times New Roman"/>
                 <w:sz w:val="36"/>
                 <w:szCs w:val="36"/>
               </w:rPr>
             </w:pPr>
+            <w:r>
+              <w:rPr>
+                <w:rFonts w:ascii="Times New Roman" w:hAnsi="Times New Roman"/>
+              </w:rPr>
+              <w:t>Usama</w:t>
+            </w:r>
           </w:p>
         </w:tc>
         <w:tc>
@@ -1040,11 +1062,17 @@
               <w:spacing w:before="0" w:after="0"/>
               <w:jc w:val="left"/>
               <w:rPr>
-                <w:rFonts w:asciiTheme="majorBidi" w:hAnsiTheme="majorBidi" w:cstheme="majorBidi"/>
+                <w:rFonts w:ascii="Times New Roman" w:hAnsi="Times New Roman"/>
                 <w:sz w:val="36"/>
                 <w:szCs w:val="36"/>
               </w:rPr>
             </w:pPr>
+            <w:r>
+              <w:rPr>
+                <w:rFonts w:ascii="Times New Roman" w:hAnsi="Times New Roman"/>
+              </w:rPr>
+              <w:t>Database Design and Testing</w:t>
+            </w:r>
           </w:p>
         </w:tc>
       </w:tr>
@@ -1062,11 +1090,17 @@
               <w:spacing w:before="0" w:after="0"/>
               <w:jc w:val="left"/>
               <w:rPr>
-                <w:rFonts w:asciiTheme="majorBidi" w:hAnsiTheme="majorBidi" w:cstheme="majorBidi"/>
+                <w:rFonts w:ascii="Times New Roman" w:hAnsi="Times New Roman"/>
                 <w:sz w:val="36"/>
                 <w:szCs w:val="36"/>
               </w:rPr>
             </w:pPr>
+            <w:r>
+              <w:rPr>
+                <w:rFonts w:ascii="Times New Roman" w:hAnsi="Times New Roman"/>
+              </w:rPr>
+              <w:t>Ehsan Shahid</w:t>
+            </w:r>
           </w:p>
         </w:tc>
         <w:tc>
@@ -1079,11 +1113,17 @@
               <w:spacing w:before="0" w:after="0"/>
               <w:jc w:val="left"/>
               <w:rPr>
-                <w:rFonts w:asciiTheme="majorBidi" w:hAnsiTheme="majorBidi" w:cstheme="majorBidi"/>
+                <w:rFonts w:ascii="Times New Roman" w:hAnsi="Times New Roman"/>
                 <w:sz w:val="36"/>
                 <w:szCs w:val="36"/>
               </w:rPr>
             </w:pPr>
+            <w:r>
+              <w:rPr>
+                <w:rFonts w:ascii="Times New Roman" w:hAnsi="Times New Roman"/>
+              </w:rPr>
+              <w:t>Mobile App Development</w:t>
+            </w:r>
           </w:p>
         </w:tc>
       </w:tr>
@@ -1113,7 +1153,7 @@
           <w:rFonts w:asciiTheme="majorBidi" w:hAnsiTheme="majorBidi" w:cstheme="majorBidi"/>
         </w:rPr>
       </w:pPr>
-      <w:bookmarkStart w:id="7" w:name="_Toc228796699"/>
+      <w:bookmarkStart w:id="8" w:name="_Toc228796699"/>
       <w:r>
         <w:rPr>
           <w:rFonts w:asciiTheme="majorBidi" w:hAnsiTheme="majorBidi" w:cstheme="majorBidi"/>
@@ -1121,7 +1161,7 @@
         <w:lastRenderedPageBreak/>
         <w:t>Table of Contents</w:t>
       </w:r>
-      <w:bookmarkEnd w:id="7"/>
+      <w:bookmarkEnd w:id="8"/>
     </w:p>
     <w:p>
       <w:pPr>
@@ -2621,8 +2661,8 @@
         </w:rPr>
         <w:br w:type="page"/>
       </w:r>
-      <w:bookmarkStart w:id="8" w:name="_Toc227192186"/>
-      <w:bookmarkStart w:id="9" w:name="_Toc228796700"/>
+      <w:bookmarkStart w:id="9" w:name="_Toc227192186"/>
+      <w:bookmarkStart w:id="10" w:name="_Toc228796700"/>
       <w:r>
         <w:rPr>
           <w:rFonts w:asciiTheme="majorBidi" w:hAnsiTheme="majorBidi" w:cstheme="majorBidi"/>
@@ -2630,8 +2670,8 @@
         <w:lastRenderedPageBreak/>
         <w:t>Revision History &amp; Sprint Log</w:t>
       </w:r>
-      <w:bookmarkEnd w:id="8"/>
       <w:bookmarkEnd w:id="9"/>
+      <w:bookmarkEnd w:id="10"/>
     </w:p>
     <w:tbl>
       <w:tblPr>
@@ -3054,18 +3094,18 @@
           <w:rFonts w:asciiTheme="majorBidi" w:hAnsiTheme="majorBidi" w:cstheme="majorBidi"/>
         </w:rPr>
       </w:pPr>
-      <w:bookmarkStart w:id="10" w:name="_Toc193285569"/>
-      <w:bookmarkStart w:id="11" w:name="_Toc193285702"/>
-      <w:bookmarkStart w:id="12" w:name="_Toc228796701"/>
+      <w:bookmarkStart w:id="11" w:name="_Toc193285569"/>
+      <w:bookmarkStart w:id="12" w:name="_Toc193285702"/>
+      <w:bookmarkStart w:id="13" w:name="_Toc228796701"/>
       <w:r>
         <w:rPr>
           <w:rFonts w:asciiTheme="majorBidi" w:hAnsiTheme="majorBidi" w:cstheme="majorBidi"/>
         </w:rPr>
         <w:t>Previous Phases Feedback</w:t>
       </w:r>
-      <w:bookmarkEnd w:id="10"/>
       <w:bookmarkEnd w:id="11"/>
       <w:bookmarkEnd w:id="12"/>
+      <w:bookmarkEnd w:id="13"/>
     </w:p>
     <w:p>
       <w:pPr>
@@ -3103,20 +3143,8 @@
       <w:pPr>
         <w:rPr>
           <w:rFonts w:asciiTheme="majorBidi" w:hAnsiTheme="majorBidi" w:cstheme="majorBidi"/>
-        </w:rPr>
-      </w:pPr>
-    </w:p>
-    <w:p>
-      <w:pPr>
-        <w:rPr>
-          <w:rFonts w:asciiTheme="majorBidi" w:hAnsiTheme="majorBidi" w:cstheme="majorBidi"/>
-        </w:rPr>
-      </w:pPr>
-    </w:p>
-    <w:p>
-      <w:pPr>
-        <w:rPr>
-          <w:rFonts w:asciiTheme="majorBidi" w:hAnsiTheme="majorBidi" w:cstheme="majorBidi"/>
+          <w:b/>
+          <w:sz w:val="28"/>
         </w:rPr>
         <w:sectPr>
           <w:headerReference w:type="default" r:id="rId10"/>
@@ -3127,6 +3155,77 @@
           <w:cols w:space="720"/>
         </w:sectPr>
       </w:pPr>
+      <w:r>
+        <w:rPr>
+          <w:noProof/>
+        </w:rPr>
+        <w:drawing>
+          <wp:anchor distT="0" distB="0" distL="114300" distR="114300" simplePos="0" relativeHeight="251658240" behindDoc="0" locked="0" layoutInCell="1" allowOverlap="1" wp14:anchorId="770F4E4C" wp14:editId="66567FA1">
+            <wp:simplePos x="0" y="0"/>
+            <wp:positionH relativeFrom="margin">
+              <wp:align>right</wp:align>
+            </wp:positionH>
+            <wp:positionV relativeFrom="paragraph">
+              <wp:posOffset>213995</wp:posOffset>
+            </wp:positionV>
+            <wp:extent cx="5943600" cy="2400300"/>
+            <wp:effectExtent l="0" t="0" r="0" b="0"/>
+            <wp:wrapThrough wrapText="bothSides">
+              <wp:wrapPolygon edited="0">
+                <wp:start x="0" y="0"/>
+                <wp:lineTo x="0" y="21429"/>
+                <wp:lineTo x="21531" y="21429"/>
+                <wp:lineTo x="21531" y="0"/>
+                <wp:lineTo x="0" y="0"/>
+              </wp:wrapPolygon>
+            </wp:wrapThrough>
+            <wp:docPr id="4" name="Picture 4"/>
+            <wp:cNvGraphicFramePr>
+              <a:graphicFrameLocks xmlns:a="http://schemas.openxmlformats.org/drawingml/2006/main" noChangeAspect="1"/>
+            </wp:cNvGraphicFramePr>
+            <a:graphic xmlns:a="http://schemas.openxmlformats.org/drawingml/2006/main">
+              <a:graphicData uri="http://schemas.openxmlformats.org/drawingml/2006/picture">
+                <pic:pic xmlns:pic="http://schemas.openxmlformats.org/drawingml/2006/picture">
+                  <pic:nvPicPr>
+                    <pic:cNvPr id="4" name="Picture 4"/>
+                    <pic:cNvPicPr>
+                      <a:picLocks noChangeAspect="1"/>
+                    </pic:cNvPicPr>
+                  </pic:nvPicPr>
+                  <pic:blipFill>
+                    <a:blip r:embed="rId12">
+                      <a:extLst>
+                        <a:ext uri="{28A0092B-C50C-407E-A947-70E740481C1C}">
+                          <a14:useLocalDpi xmlns:a14="http://schemas.microsoft.com/office/drawing/2010/main" val="0"/>
+                        </a:ext>
+                      </a:extLst>
+                    </a:blip>
+                    <a:srcRect/>
+                    <a:stretch>
+                      <a:fillRect/>
+                    </a:stretch>
+                  </pic:blipFill>
+                  <pic:spPr bwMode="auto">
+                    <a:xfrm>
+                      <a:off x="0" y="0"/>
+                      <a:ext cx="5943600" cy="2400300"/>
+                    </a:xfrm>
+                    <a:prstGeom prst="rect">
+                      <a:avLst/>
+                    </a:prstGeom>
+                    <a:noFill/>
+                  </pic:spPr>
+                </pic:pic>
+              </a:graphicData>
+            </a:graphic>
+          </wp:anchor>
+        </w:drawing>
+      </w:r>
+    </w:p>
+    <w:p>
+      <w:bookmarkStart w:id="14" w:name="_Toc79435522"/>
+      <w:bookmarkStart w:id="15" w:name="_Toc79435314"/>
+      <w:bookmarkStart w:id="16" w:name="_Toc439994665"/>
     </w:p>
     <w:p>
       <w:pPr>
@@ -3140,32 +3239,105 @@
           <w:rFonts w:asciiTheme="majorBidi" w:hAnsiTheme="majorBidi" w:cstheme="majorBidi"/>
         </w:rPr>
       </w:pPr>
-      <w:bookmarkStart w:id="13" w:name="_Toc79435522"/>
-      <w:bookmarkStart w:id="14" w:name="_Toc79435314"/>
-      <w:bookmarkStart w:id="15" w:name="_Toc439994665"/>
-    </w:p>
-    <w:p>
-      <w:pPr>
-        <w:pStyle w:val="Heading1"/>
-        <w:numPr>
-          <w:ilvl w:val="0"/>
-          <w:numId w:val="0"/>
-        </w:numPr>
-        <w:jc w:val="center"/>
-        <w:rPr>
-          <w:rFonts w:asciiTheme="majorBidi" w:hAnsiTheme="majorBidi" w:cstheme="majorBidi"/>
-        </w:rPr>
-      </w:pPr>
-      <w:bookmarkStart w:id="16" w:name="_Toc228796702"/>
+      <w:bookmarkStart w:id="17" w:name="_Toc228796702"/>
       <w:r>
         <w:rPr>
           <w:rFonts w:asciiTheme="majorBidi" w:hAnsiTheme="majorBidi" w:cstheme="majorBidi"/>
         </w:rPr>
         <w:t>Abstract</w:t>
       </w:r>
-      <w:bookmarkEnd w:id="13"/>
       <w:bookmarkEnd w:id="14"/>
-      <w:bookmarkEnd w:id="16"/>
+      <w:bookmarkEnd w:id="15"/>
+      <w:bookmarkEnd w:id="17"/>
+    </w:p>
+    <w:p>
+      <w:pPr>
+        <w:jc w:val="both"/>
+        <w:rPr>
+          <w:rFonts w:asciiTheme="majorBidi" w:hAnsiTheme="majorBidi" w:cstheme="majorBidi"/>
+          <w:szCs w:val="24"/>
+        </w:rPr>
+      </w:pPr>
+      <w:r>
+        <w:rPr>
+          <w:rFonts w:asciiTheme="majorBidi" w:hAnsiTheme="majorBidi" w:cstheme="majorBidi"/>
+          <w:szCs w:val="24"/>
+        </w:rPr>
+        <w:t>PetLink is a cross-platform web and mobile application developed to serve as a comprehensive pet management platform. It provides a centralized digital solution for pet owners, adopters, buyers, and small service providers in Pakistan, enabling them to manage all pet-related activities through a single, user-friendly system.</w:t>
+      </w:r>
+    </w:p>
+    <w:p>
+      <w:pPr>
+        <w:jc w:val="both"/>
+        <w:rPr>
+          <w:rFonts w:asciiTheme="majorBidi" w:hAnsiTheme="majorBidi" w:cstheme="majorBidi"/>
+          <w:szCs w:val="24"/>
+        </w:rPr>
+      </w:pPr>
+    </w:p>
+    <w:p>
+      <w:pPr>
+        <w:jc w:val="both"/>
+        <w:rPr>
+          <w:rFonts w:asciiTheme="majorBidi" w:hAnsiTheme="majorBidi" w:cstheme="majorBidi"/>
+          <w:szCs w:val="24"/>
+        </w:rPr>
+      </w:pPr>
+      <w:r>
+        <w:rPr>
+          <w:rFonts w:asciiTheme="majorBidi" w:hAnsiTheme="majorBidi" w:cstheme="majorBidi"/>
+          <w:szCs w:val="24"/>
+        </w:rPr>
+        <w:t>In today’s fragmented environment, pet owners face significant challenges when they want to sell or adopt a pet, arrange temporary shelter during travel, purchase pet products, or maintain accurate health records. Most activities are currently handled through scattered social media groups, informal WhatsApp listings, or separate unconnected websites. This leads to incomplete information, lack of trust, difficulty in tracking vaccination schedules,</w:t>
+      </w:r>
+      <w:r>
+        <w:rPr>
+          <w:rFonts w:asciiTheme="majorBidi" w:hAnsiTheme="majorBidi" w:cstheme="majorBidi"/>
+          <w:szCs w:val="24"/>
+        </w:rPr>
+        <w:t xml:space="preserve"> </w:t>
+      </w:r>
+      <w:r>
+        <w:rPr>
+          <w:rFonts w:asciiTheme="majorBidi" w:hAnsiTheme="majorBidi" w:cstheme="majorBidi"/>
+          <w:szCs w:val="24"/>
+        </w:rPr>
+        <w:t>unreliable service coordination, and increased risk of missing important pet care deadlines.</w:t>
+      </w:r>
+    </w:p>
+    <w:p>
+      <w:pPr>
+        <w:jc w:val="both"/>
+        <w:rPr>
+          <w:rFonts w:asciiTheme="majorBidi" w:hAnsiTheme="majorBidi" w:cstheme="majorBidi"/>
+          <w:szCs w:val="24"/>
+        </w:rPr>
+      </w:pPr>
+    </w:p>
+    <w:p>
+      <w:pPr>
+        <w:jc w:val="both"/>
+        <w:rPr>
+          <w:rFonts w:asciiTheme="majorBidi" w:hAnsiTheme="majorBidi" w:cstheme="majorBidi"/>
+          <w:szCs w:val="24"/>
+        </w:rPr>
+      </w:pPr>
+      <w:r>
+        <w:rPr>
+          <w:rFonts w:asciiTheme="majorBidi" w:hAnsiTheme="majorBidi" w:cstheme="majorBidi"/>
+          <w:szCs w:val="24"/>
+        </w:rPr>
+        <w:t>The proposed system offers a complete set of functionalities including user and pet profile management, pet adoption and sale listings with proper validation, temporary shelter service requests, an integrated pet product store with secure payment gateway, digital pet health and vaccination record management with automated reminders, Google Maps-based nearby veterinary clinic locator, and a custom AI-driven chatbot for instant user assistance and guidance.</w:t>
+      </w:r>
+    </w:p>
+    <w:p>
+      <w:pPr>
+        <w:jc w:val="both"/>
+        <w:rPr>
+          <w:rFonts w:asciiTheme="majorBidi" w:hAnsiTheme="majorBidi" w:cstheme="majorBidi"/>
+          <w:szCs w:val="24"/>
+        </w:rPr>
+      </w:pPr>
     </w:p>
     <w:p>
       <w:pPr>
@@ -3188,21 +3360,7 @@
           <w:rFonts w:asciiTheme="majorBidi" w:hAnsiTheme="majorBidi" w:cstheme="majorBidi"/>
           <w:szCs w:val="24"/>
         </w:rPr>
-        <w:t xml:space="preserve">Abstract gives the summary of your project. You should focus on the problem description, significance of the problem, knowledge areas to be used and the results to be acquired. Make sure it does not turn out to be an introduction to the introduction / background but summarizes the whole </w:t>
-      </w:r>
-      <w:r>
-        <w:rPr>
-          <w:rFonts w:asciiTheme="majorBidi" w:hAnsiTheme="majorBidi" w:cstheme="majorBidi"/>
-          <w:szCs w:val="24"/>
-        </w:rPr>
-        <w:t>project</w:t>
-      </w:r>
-      <w:r>
-        <w:rPr>
-          <w:rFonts w:asciiTheme="majorBidi" w:hAnsiTheme="majorBidi" w:cstheme="majorBidi"/>
-          <w:szCs w:val="24"/>
-        </w:rPr>
-        <w:t>.</w:t>
+        <w:t>By addressing these issues, PetLink fulfills a vital public need in the growing pet ownership community of Pakistan. It improves pet welfare through better record-keeping and timely care, enhances trust and transparency in pet trading and services, reduces fragmentation in the market, and provides a reliable, accessible platform that brings convenience and organization to thousands of pet lovers and service providers.</w:t>
       </w:r>
     </w:p>
     <w:p>
@@ -3212,10 +3370,10 @@
           <w:rFonts w:asciiTheme="majorBidi" w:hAnsiTheme="majorBidi" w:cstheme="majorBidi"/>
         </w:rPr>
       </w:pPr>
-      <w:bookmarkStart w:id="17" w:name="_Toc228796703"/>
-      <w:bookmarkStart w:id="18" w:name="_Toc404358655"/>
-      <w:bookmarkStart w:id="19" w:name="_Toc439994696"/>
-      <w:bookmarkEnd w:id="15"/>
+      <w:bookmarkStart w:id="18" w:name="_Toc228796703"/>
+      <w:bookmarkStart w:id="19" w:name="_Toc404358655"/>
+      <w:bookmarkStart w:id="20" w:name="_Toc439994696"/>
+      <w:bookmarkEnd w:id="16"/>
       <w:r>
         <w:rPr>
           <w:rFonts w:asciiTheme="majorBidi" w:hAnsiTheme="majorBidi" w:cstheme="majorBidi"/>
@@ -3223,7 +3381,7 @@
         <w:lastRenderedPageBreak/>
         <w:t>System Architecture</w:t>
       </w:r>
-      <w:bookmarkEnd w:id="17"/>
+      <w:bookmarkEnd w:id="18"/>
     </w:p>
     <w:p>
       <w:pPr>
@@ -3232,14 +3390,14 @@
           <w:rFonts w:asciiTheme="majorBidi" w:hAnsiTheme="majorBidi" w:cstheme="majorBidi"/>
         </w:rPr>
       </w:pPr>
-      <w:bookmarkStart w:id="20" w:name="_Toc228796704"/>
+      <w:bookmarkStart w:id="21" w:name="_Toc228796704"/>
       <w:r>
         <w:rPr>
           <w:rFonts w:asciiTheme="majorBidi" w:hAnsiTheme="majorBidi" w:cstheme="majorBidi"/>
         </w:rPr>
         <w:t>High-Level Architecture</w:t>
       </w:r>
-      <w:bookmarkEnd w:id="20"/>
+      <w:bookmarkEnd w:id="21"/>
     </w:p>
     <w:p>
       <w:pPr>
@@ -3315,14 +3473,14 @@
           <w:rFonts w:asciiTheme="majorBidi" w:hAnsiTheme="majorBidi" w:cstheme="majorBidi"/>
         </w:rPr>
       </w:pPr>
-      <w:bookmarkStart w:id="21" w:name="_Toc228796705"/>
+      <w:bookmarkStart w:id="22" w:name="_Toc228796705"/>
       <w:r>
         <w:rPr>
           <w:rFonts w:asciiTheme="majorBidi" w:hAnsiTheme="majorBidi" w:cstheme="majorBidi"/>
         </w:rPr>
         <w:t>Architecture Diagram</w:t>
       </w:r>
-      <w:bookmarkEnd w:id="21"/>
+      <w:bookmarkEnd w:id="22"/>
     </w:p>
     <w:p>
       <w:pPr>
@@ -3346,14 +3504,14 @@
           <w:rFonts w:asciiTheme="majorBidi" w:hAnsiTheme="majorBidi" w:cstheme="majorBidi"/>
         </w:rPr>
       </w:pPr>
-      <w:bookmarkStart w:id="22" w:name="_Toc228796706"/>
+      <w:bookmarkStart w:id="23" w:name="_Toc228796706"/>
       <w:r>
         <w:rPr>
           <w:rFonts w:asciiTheme="majorBidi" w:hAnsiTheme="majorBidi" w:cstheme="majorBidi"/>
         </w:rPr>
         <w:t>Component Overview</w:t>
       </w:r>
-      <w:bookmarkEnd w:id="22"/>
+      <w:bookmarkEnd w:id="23"/>
     </w:p>
     <w:p>
       <w:pPr>
@@ -3403,7 +3561,7 @@
           <w:rFonts w:asciiTheme="majorBidi" w:hAnsiTheme="majorBidi" w:cstheme="majorBidi"/>
         </w:rPr>
       </w:pPr>
-      <w:bookmarkStart w:id="23" w:name="_Toc228796707"/>
+      <w:bookmarkStart w:id="24" w:name="_Toc228796707"/>
       <w:r>
         <w:rPr>
           <w:rFonts w:asciiTheme="majorBidi" w:hAnsiTheme="majorBidi" w:cstheme="majorBidi"/>
@@ -3411,7 +3569,7 @@
         <w:lastRenderedPageBreak/>
         <w:t>Mapping Design to User Stories</w:t>
       </w:r>
-      <w:bookmarkEnd w:id="23"/>
+      <w:bookmarkEnd w:id="24"/>
     </w:p>
     <w:p>
       <w:pPr>
@@ -3627,7 +3785,7 @@
           <w:rFonts w:asciiTheme="majorBidi" w:hAnsiTheme="majorBidi" w:cstheme="majorBidi"/>
         </w:rPr>
       </w:pPr>
-      <w:bookmarkStart w:id="24" w:name="_Toc228796708"/>
+      <w:bookmarkStart w:id="25" w:name="_Toc228796708"/>
       <w:r>
         <w:rPr>
           <w:rFonts w:asciiTheme="majorBidi" w:hAnsiTheme="majorBidi" w:cstheme="majorBidi"/>
@@ -3635,7 +3793,7 @@
         <w:lastRenderedPageBreak/>
         <w:t>Detailed System Design</w:t>
       </w:r>
-      <w:bookmarkEnd w:id="24"/>
+      <w:bookmarkEnd w:id="25"/>
     </w:p>
     <w:p>
       <w:pPr>
@@ -3644,14 +3802,14 @@
           <w:rFonts w:asciiTheme="majorBidi" w:hAnsiTheme="majorBidi" w:cstheme="majorBidi"/>
         </w:rPr>
       </w:pPr>
-      <w:bookmarkStart w:id="25" w:name="_Toc228796709"/>
+      <w:bookmarkStart w:id="26" w:name="_Toc228796709"/>
       <w:r>
         <w:rPr>
           <w:rFonts w:asciiTheme="majorBidi" w:hAnsiTheme="majorBidi" w:cstheme="majorBidi"/>
         </w:rPr>
         <w:t>Module Decomposition</w:t>
       </w:r>
-      <w:bookmarkEnd w:id="25"/>
+      <w:bookmarkEnd w:id="26"/>
     </w:p>
     <w:p>
       <w:pPr>
@@ -3747,14 +3905,14 @@
           <w:rFonts w:asciiTheme="majorBidi" w:hAnsiTheme="majorBidi" w:cstheme="majorBidi"/>
         </w:rPr>
       </w:pPr>
-      <w:bookmarkStart w:id="26" w:name="_Toc228796710"/>
+      <w:bookmarkStart w:id="27" w:name="_Toc228796710"/>
       <w:r>
         <w:rPr>
           <w:rFonts w:asciiTheme="majorBidi" w:hAnsiTheme="majorBidi" w:cstheme="majorBidi"/>
         </w:rPr>
         <w:t>Data Flow Description</w:t>
       </w:r>
-      <w:bookmarkEnd w:id="26"/>
+      <w:bookmarkEnd w:id="27"/>
     </w:p>
     <w:p>
       <w:pPr>
@@ -3822,7 +3980,7 @@
           <w:rFonts w:asciiTheme="majorBidi" w:hAnsiTheme="majorBidi" w:cstheme="majorBidi"/>
         </w:rPr>
       </w:pPr>
-      <w:bookmarkStart w:id="27" w:name="_Toc228796711"/>
+      <w:bookmarkStart w:id="28" w:name="_Toc228796711"/>
       <w:r>
         <w:rPr>
           <w:rFonts w:asciiTheme="majorBidi" w:hAnsiTheme="majorBidi" w:cstheme="majorBidi"/>
@@ -3830,7 +3988,7 @@
         <w:lastRenderedPageBreak/>
         <w:t>UML Diagrams</w:t>
       </w:r>
-      <w:bookmarkEnd w:id="27"/>
+      <w:bookmarkEnd w:id="28"/>
     </w:p>
     <w:p>
       <w:pPr>
@@ -3955,7 +4113,7 @@
           <w:rFonts w:asciiTheme="majorBidi" w:hAnsiTheme="majorBidi" w:cstheme="majorBidi"/>
         </w:rPr>
       </w:pPr>
-      <w:bookmarkStart w:id="28" w:name="_Toc228796712"/>
+      <w:bookmarkStart w:id="29" w:name="_Toc228796712"/>
       <w:r>
         <w:rPr>
           <w:rFonts w:asciiTheme="majorBidi" w:hAnsiTheme="majorBidi" w:cstheme="majorBidi"/>
@@ -3963,7 +4121,7 @@
         <w:lastRenderedPageBreak/>
         <w:t>Database Design (ERD)</w:t>
       </w:r>
-      <w:bookmarkEnd w:id="28"/>
+      <w:bookmarkEnd w:id="29"/>
     </w:p>
     <w:p>
       <w:pPr>
@@ -3972,14 +4130,14 @@
           <w:rFonts w:asciiTheme="majorBidi" w:hAnsiTheme="majorBidi" w:cstheme="majorBidi"/>
         </w:rPr>
       </w:pPr>
-      <w:bookmarkStart w:id="29" w:name="_Toc228796713"/>
+      <w:bookmarkStart w:id="30" w:name="_Toc228796713"/>
       <w:r>
         <w:rPr>
           <w:rFonts w:asciiTheme="majorBidi" w:hAnsiTheme="majorBidi" w:cstheme="majorBidi"/>
         </w:rPr>
         <w:t>ER Diagram</w:t>
       </w:r>
-      <w:bookmarkEnd w:id="29"/>
+      <w:bookmarkEnd w:id="30"/>
     </w:p>
     <w:p>
       <w:pPr>
@@ -4015,14 +4173,14 @@
           <w:rFonts w:asciiTheme="majorBidi" w:hAnsiTheme="majorBidi" w:cstheme="majorBidi"/>
         </w:rPr>
       </w:pPr>
-      <w:bookmarkStart w:id="30" w:name="_Toc228796714"/>
+      <w:bookmarkStart w:id="31" w:name="_Toc228796714"/>
       <w:r>
         <w:rPr>
           <w:rFonts w:asciiTheme="majorBidi" w:hAnsiTheme="majorBidi" w:cstheme="majorBidi"/>
         </w:rPr>
         <w:t>Schema Tables</w:t>
       </w:r>
-      <w:bookmarkEnd w:id="30"/>
+      <w:bookmarkEnd w:id="31"/>
     </w:p>
     <w:p>
       <w:pPr>
@@ -4054,21 +4212,7 @@
         <w:rPr>
           <w:rFonts w:asciiTheme="majorBidi" w:hAnsiTheme="majorBidi" w:cstheme="majorBidi"/>
         </w:rPr>
-        <w:t xml:space="preserve"> (e.g., </w:t>
-      </w:r>
-      <w:proofErr w:type="spellStart"/>
-      <w:r>
-        <w:rPr>
-          <w:rFonts w:asciiTheme="majorBidi" w:hAnsiTheme="majorBidi" w:cstheme="majorBidi"/>
-        </w:rPr>
-        <w:t>user_id</w:t>
-      </w:r>
-      <w:proofErr w:type="spellEnd"/>
-      <w:r>
-        <w:rPr>
-          <w:rFonts w:asciiTheme="majorBidi" w:hAnsiTheme="majorBidi" w:cstheme="majorBidi"/>
-        </w:rPr>
-        <w:t xml:space="preserve"> : INT, Primary Key).</w:t>
+        <w:t xml:space="preserve"> (e.g., user_id : INT, Primary Key).</w:t>
       </w:r>
       <w:r>
         <w:rPr>
@@ -4085,6 +4229,48 @@
           <w:szCs w:val="24"/>
         </w:rPr>
       </w:pPr>
+      <w:r>
+        <w:rPr>
+          <w:rFonts w:asciiTheme="majorBidi" w:hAnsiTheme="majorBidi" w:cstheme="majorBidi"/>
+          <w:noProof/>
+          <w:szCs w:val="24"/>
+        </w:rPr>
+        <w:drawing>
+          <wp:inline distT="0" distB="0" distL="0" distR="0" wp14:anchorId="2AC7385A" wp14:editId="6031D660">
+            <wp:extent cx="6309360" cy="2436495"/>
+            <wp:effectExtent l="0" t="0" r="0" b="1905"/>
+            <wp:docPr id="2" name="Picture 2"/>
+            <wp:cNvGraphicFramePr>
+              <a:graphicFrameLocks xmlns:a="http://schemas.openxmlformats.org/drawingml/2006/main" noChangeAspect="1"/>
+            </wp:cNvGraphicFramePr>
+            <a:graphic xmlns:a="http://schemas.openxmlformats.org/drawingml/2006/main">
+              <a:graphicData uri="http://schemas.openxmlformats.org/drawingml/2006/picture">
+                <pic:pic xmlns:pic="http://schemas.openxmlformats.org/drawingml/2006/picture">
+                  <pic:nvPicPr>
+                    <pic:cNvPr id="1" name=""/>
+                    <pic:cNvPicPr/>
+                  </pic:nvPicPr>
+                  <pic:blipFill>
+                    <a:blip r:embed="rId13"/>
+                    <a:stretch>
+                      <a:fillRect/>
+                    </a:stretch>
+                  </pic:blipFill>
+                  <pic:spPr>
+                    <a:xfrm>
+                      <a:off x="0" y="0"/>
+                      <a:ext cx="6309360" cy="2436495"/>
+                    </a:xfrm>
+                    <a:prstGeom prst="rect">
+                      <a:avLst/>
+                    </a:prstGeom>
+                  </pic:spPr>
+                </pic:pic>
+              </a:graphicData>
+            </a:graphic>
+          </wp:inline>
+        </w:drawing>
+      </w:r>
     </w:p>
     <w:p>
       <w:pPr>
@@ -4110,7 +4296,7 @@
           <w:rFonts w:asciiTheme="majorBidi" w:hAnsiTheme="majorBidi" w:cstheme="majorBidi"/>
         </w:rPr>
       </w:pPr>
-      <w:bookmarkStart w:id="31" w:name="_Toc228796715"/>
+      <w:bookmarkStart w:id="32" w:name="_Toc228796715"/>
       <w:r>
         <w:rPr>
           <w:rFonts w:asciiTheme="majorBidi" w:hAnsiTheme="majorBidi" w:cstheme="majorBidi"/>
@@ -4118,7 +4304,7 @@
         <w:lastRenderedPageBreak/>
         <w:t>API Design</w:t>
       </w:r>
-      <w:bookmarkEnd w:id="31"/>
+      <w:bookmarkEnd w:id="32"/>
     </w:p>
     <w:p>
       <w:pPr>
@@ -4193,25 +4379,7 @@
           <w:i/>
           <w:sz w:val="22"/>
         </w:rPr>
-        <w:t>/</w:t>
-      </w:r>
-      <w:proofErr w:type="spellStart"/>
-      <w:r>
-        <w:rPr>
-          <w:rFonts w:asciiTheme="majorBidi" w:hAnsiTheme="majorBidi" w:cstheme="majorBidi"/>
-          <w:i/>
-          <w:sz w:val="22"/>
-        </w:rPr>
-        <w:t>api</w:t>
-      </w:r>
-      <w:proofErr w:type="spellEnd"/>
-      <w:r>
-        <w:rPr>
-          <w:rFonts w:asciiTheme="majorBidi" w:hAnsiTheme="majorBidi" w:cstheme="majorBidi"/>
-          <w:i/>
-          <w:sz w:val="22"/>
-        </w:rPr>
-        <w:t>/login</w:t>
+        <w:t>/api/login</w:t>
       </w:r>
       <w:r>
         <w:rPr>
@@ -4577,7 +4745,7 @@
           <w:rFonts w:asciiTheme="majorBidi" w:hAnsiTheme="majorBidi" w:cstheme="majorBidi"/>
         </w:rPr>
       </w:pPr>
-      <w:bookmarkStart w:id="32" w:name="_Toc228796716"/>
+      <w:bookmarkStart w:id="33" w:name="_Toc228796716"/>
       <w:r>
         <w:rPr>
           <w:rFonts w:asciiTheme="majorBidi" w:hAnsiTheme="majorBidi" w:cstheme="majorBidi"/>
@@ -4585,7 +4753,7 @@
         <w:lastRenderedPageBreak/>
         <w:t>UI/UX Design (Prototypes)</w:t>
       </w:r>
-      <w:bookmarkEnd w:id="32"/>
+      <w:bookmarkEnd w:id="33"/>
     </w:p>
     <w:p>
       <w:pPr>
@@ -4722,7 +4890,7 @@
           <w:rFonts w:asciiTheme="majorBidi" w:hAnsiTheme="majorBidi" w:cstheme="majorBidi"/>
         </w:rPr>
       </w:pPr>
-      <w:bookmarkStart w:id="33" w:name="_Toc228796717"/>
+      <w:bookmarkStart w:id="34" w:name="_Toc228796717"/>
       <w:r>
         <w:rPr>
           <w:rFonts w:asciiTheme="majorBidi" w:hAnsiTheme="majorBidi" w:cstheme="majorBidi"/>
@@ -4730,7 +4898,7 @@
         <w:lastRenderedPageBreak/>
         <w:t>Sprint-wise Design Evolution</w:t>
       </w:r>
-      <w:bookmarkEnd w:id="33"/>
+      <w:bookmarkEnd w:id="34"/>
     </w:p>
     <w:p>
       <w:pPr>
@@ -5134,7 +5302,7 @@
           <w:rFonts w:asciiTheme="majorBidi" w:hAnsiTheme="majorBidi" w:cstheme="majorBidi"/>
         </w:rPr>
       </w:pPr>
-      <w:bookmarkStart w:id="34" w:name="_Toc228796718"/>
+      <w:bookmarkStart w:id="35" w:name="_Toc228796718"/>
       <w:r>
         <w:rPr>
           <w:rFonts w:asciiTheme="majorBidi" w:hAnsiTheme="majorBidi" w:cstheme="majorBidi"/>
@@ -5142,7 +5310,7 @@
         <w:lastRenderedPageBreak/>
         <w:t>Test Design</w:t>
       </w:r>
-      <w:bookmarkEnd w:id="34"/>
+      <w:bookmarkEnd w:id="35"/>
     </w:p>
     <w:p>
       <w:pPr>
@@ -5572,7 +5740,7 @@
           <w:rFonts w:asciiTheme="majorBidi" w:hAnsiTheme="majorBidi" w:cstheme="majorBidi"/>
         </w:rPr>
       </w:pPr>
-      <w:bookmarkStart w:id="35" w:name="_Toc228796719"/>
+      <w:bookmarkStart w:id="36" w:name="_Toc228796719"/>
       <w:r>
         <w:rPr>
           <w:rFonts w:asciiTheme="majorBidi" w:hAnsiTheme="majorBidi" w:cstheme="majorBidi"/>
@@ -5580,7 +5748,7 @@
         <w:lastRenderedPageBreak/>
         <w:t>Design Quality Attributes</w:t>
       </w:r>
-      <w:bookmarkEnd w:id="35"/>
+      <w:bookmarkEnd w:id="36"/>
     </w:p>
     <w:p>
       <w:pPr>
@@ -5726,7 +5894,7 @@
           <w:rFonts w:asciiTheme="majorBidi" w:hAnsiTheme="majorBidi" w:cstheme="majorBidi"/>
         </w:rPr>
       </w:pPr>
-      <w:bookmarkStart w:id="36" w:name="_Toc228796720"/>
+      <w:bookmarkStart w:id="37" w:name="_Toc228796720"/>
       <w:r>
         <w:rPr>
           <w:rFonts w:asciiTheme="majorBidi" w:hAnsiTheme="majorBidi" w:cstheme="majorBidi"/>
@@ -5734,7 +5902,7 @@
         <w:lastRenderedPageBreak/>
         <w:t>Deployment Considerations</w:t>
       </w:r>
-      <w:bookmarkEnd w:id="36"/>
+      <w:bookmarkEnd w:id="37"/>
     </w:p>
     <w:p>
       <w:pPr>
@@ -5855,7 +6023,7 @@
           <w:rFonts w:asciiTheme="majorBidi" w:hAnsiTheme="majorBidi" w:cstheme="majorBidi"/>
         </w:rPr>
       </w:pPr>
-      <w:bookmarkStart w:id="37" w:name="_Toc228796721"/>
+      <w:bookmarkStart w:id="38" w:name="_Toc228796721"/>
       <w:r>
         <w:rPr>
           <w:rFonts w:asciiTheme="majorBidi" w:hAnsiTheme="majorBidi" w:cstheme="majorBidi"/>
@@ -5863,7 +6031,7 @@
         <w:lastRenderedPageBreak/>
         <w:t>Future Enhancements</w:t>
       </w:r>
-      <w:bookmarkEnd w:id="37"/>
+      <w:bookmarkEnd w:id="38"/>
     </w:p>
     <w:p>
       <w:pPr>
@@ -5904,7 +6072,7 @@
           <w:rFonts w:asciiTheme="majorBidi" w:hAnsiTheme="majorBidi" w:cstheme="majorBidi"/>
         </w:rPr>
       </w:pPr>
-      <w:bookmarkStart w:id="38" w:name="_Toc228796722"/>
+      <w:bookmarkStart w:id="39" w:name="_Toc228796722"/>
       <w:r>
         <w:rPr>
           <w:rFonts w:asciiTheme="majorBidi" w:hAnsiTheme="majorBidi" w:cstheme="majorBidi"/>
@@ -5912,8 +6080,8 @@
         <w:lastRenderedPageBreak/>
         <w:t>Revised Project Plan</w:t>
       </w:r>
-      <w:bookmarkEnd w:id="18"/>
-      <w:bookmarkEnd w:id="38"/>
+      <w:bookmarkEnd w:id="19"/>
+      <w:bookmarkEnd w:id="39"/>
     </w:p>
     <w:p>
       <w:pPr>
@@ -5964,7 +6132,7 @@
           <w:sz w:val="36"/>
         </w:rPr>
       </w:pPr>
-      <w:bookmarkStart w:id="39" w:name="_Toc439994672"/>
+      <w:bookmarkStart w:id="40" w:name="_Toc439994672"/>
       <w:r>
         <w:rPr>
           <w:rFonts w:asciiTheme="majorBidi" w:hAnsiTheme="majorBidi" w:cstheme="majorBidi"/>
@@ -5980,7 +6148,7 @@
           <w:rFonts w:asciiTheme="majorBidi" w:hAnsiTheme="majorBidi" w:cstheme="majorBidi"/>
         </w:rPr>
       </w:pPr>
-      <w:bookmarkStart w:id="40" w:name="_Toc228796723"/>
+      <w:bookmarkStart w:id="41" w:name="_Toc228796723"/>
       <w:r>
         <w:rPr>
           <w:rFonts w:asciiTheme="majorBidi" w:hAnsiTheme="majorBidi" w:cstheme="majorBidi"/>
@@ -5988,8 +6156,8 @@
         <w:lastRenderedPageBreak/>
         <w:t>References</w:t>
       </w:r>
-      <w:bookmarkEnd w:id="39"/>
       <w:bookmarkEnd w:id="40"/>
+      <w:bookmarkEnd w:id="41"/>
     </w:p>
     <w:p>
       <w:pPr>
@@ -6038,15 +6206,15 @@
           <w:rFonts w:asciiTheme="majorBidi" w:hAnsiTheme="majorBidi" w:cstheme="majorBidi"/>
         </w:rPr>
       </w:pPr>
-      <w:bookmarkStart w:id="41" w:name="_Toc228796724"/>
+      <w:bookmarkStart w:id="42" w:name="_Toc228796724"/>
       <w:r>
         <w:rPr>
           <w:rFonts w:asciiTheme="majorBidi" w:hAnsiTheme="majorBidi" w:cstheme="majorBidi"/>
         </w:rPr>
         <w:t>Appendix A: Glossary</w:t>
       </w:r>
-      <w:bookmarkEnd w:id="19"/>
-      <w:bookmarkEnd w:id="41"/>
+      <w:bookmarkEnd w:id="20"/>
+      <w:bookmarkEnd w:id="42"/>
     </w:p>
     <w:p>
       <w:pPr>
@@ -6070,15 +6238,15 @@
           <w:rFonts w:asciiTheme="majorBidi" w:hAnsiTheme="majorBidi" w:cstheme="majorBidi"/>
         </w:rPr>
       </w:pPr>
-      <w:bookmarkStart w:id="42" w:name="_Toc439994697"/>
+      <w:bookmarkStart w:id="43" w:name="_Toc439994697"/>
       <w:r>
         <w:rPr>
           <w:rFonts w:asciiTheme="majorBidi" w:hAnsiTheme="majorBidi" w:cstheme="majorBidi"/>
         </w:rPr>
         <w:br w:type="page"/>
       </w:r>
-      <w:bookmarkStart w:id="43" w:name="_Toc228796725"/>
-      <w:bookmarkEnd w:id="42"/>
+      <w:bookmarkStart w:id="44" w:name="_Toc228796725"/>
+      <w:bookmarkEnd w:id="43"/>
       <w:r>
         <w:rPr>
           <w:rFonts w:asciiTheme="majorBidi" w:hAnsiTheme="majorBidi" w:cstheme="majorBidi"/>
@@ -6098,7 +6266,7 @@
         </w:rPr>
         <w:t>: IV &amp; V Report</w:t>
       </w:r>
-      <w:bookmarkEnd w:id="43"/>
+      <w:bookmarkEnd w:id="44"/>
     </w:p>
     <w:p>
       <w:pPr>
@@ -7079,19 +7247,7 @@
       <w:pStyle w:val="Footer"/>
     </w:pPr>
     <w:r>
-      <w:t>&lt;</w:t>
-    </w:r>
-    <w:r>
-      <w:t>Group</w:t>
-    </w:r>
-    <w:r>
-      <w:t xml:space="preserve"> </w:t>
-    </w:r>
-    <w:r>
-      <w:t>ID</w:t>
-    </w:r>
-    <w:r>
-      <w:t>&gt;</w:t>
+      <w:t>S26SE025</w:t>
     </w:r>
     <w:r>
       <w:tab/>
@@ -7199,7 +7355,7 @@
       <w:jc w:val="center"/>
     </w:pPr>
     <w:r>
-      <w:t>&lt;Project Name&gt;</w:t>
+      <w:t>PetLink</w:t>
     </w:r>
   </w:p>
 </w:hdr>
@@ -9831,7 +9987,7 @@
     <w:rPrDefault>
       <w:rPr>
         <w:rFonts w:ascii="Times New Roman" w:eastAsia="Times New Roman" w:hAnsi="Times New Roman" w:cs="Times New Roman"/>
-        <w:lang w:bidi="ar-SA"/>
+        <w:lang w:val="en-US" w:eastAsia="en-US" w:bidi="ar-SA"/>
       </w:rPr>
     </w:rPrDefault>
     <w:pPrDefault/>
@@ -10223,7 +10379,6 @@
     <w:rPr>
       <w:rFonts w:ascii="Times" w:hAnsi="Times"/>
       <w:sz w:val="24"/>
-      <w:lang w:val="en-US" w:eastAsia="en-US"/>
     </w:rPr>
   </w:style>
   <w:style w:type="paragraph" w:styleId="Heading1">
@@ -10793,7 +10948,7 @@
       <w:rFonts w:eastAsia="SimSun" w:cs="Courier"/>
       <w:sz w:val="24"/>
       <w:szCs w:val="28"/>
-      <w:lang w:val="en-US" w:eastAsia="zh-CN" w:bidi="th-TH"/>
+      <w:lang w:eastAsia="zh-CN" w:bidi="th-TH"/>
     </w:rPr>
   </w:style>
   <w:style w:type="paragraph" w:styleId="BodyText">

</xml_diff>